<commit_message>
docs: renombrar roles sin administrador, matriz de cobertura zero trust y retiro explicito del php
</commit_message>
<xml_diff>
--- a/docs/SIGET_Arquitectura_Zero_Trust.docx
+++ b/docs/SIGET_Arquitectura_Zero_Trust.docx
@@ -150,7 +150,7 @@
           <w:b/>
           <w:bCs/>
         </w:rPr>
-        <w:t xml:space="preserve">cada actuación sobre un trámite ante el Estado queda registrada de forma que nadie pueda alterarla, ni siquiera un administrador</w:t>
+        <w:t xml:space="preserve">cada actuación sobre un trámite ante el Estado queda registrada de forma que nadie pueda alterarla, ni siquiera quien opera la plataforma</w:t>
       </w:r>
       <w:r>
         <w:t xml:space="preserve">, con plazos exigibles y escalamiento automático cuando se vencen. La seguridad no es un adorno: es el mecanismo que hace confiable la trazabilidad. Como SIGET integra trámites de varias instituciones, el desafío central es que </w:t>
@@ -1315,6 +1315,82 @@
           </w:p>
         </w:tc>
       </w:tr>
+      <w:tr>
+        <w:trPr>
+          <w:cantSplit/>
+          <w:tblHeader w:val="off"/>
+        </w:trPr>
+        <w:tc>
+          <w:tcPr>
+            <w:tcW w:type="dxa" w:w="2674"/>
+            <w:tcBorders>
+              <w:top w:val="single" w:color="BFBFBF" w:sz="4"/>
+              <w:left w:val="single" w:color="BFBFBF" w:sz="4"/>
+              <w:bottom w:val="single" w:color="BFBFBF" w:sz="4"/>
+              <w:right w:val="single" w:color="BFBFBF" w:sz="4"/>
+            </w:tcBorders>
+            <w:shd w:fill="F2F7FB" w:val="clear"/>
+            <w:tcMar>
+              <w:top w:type="dxa" w:w="60"/>
+              <w:left w:type="dxa" w:w="100"/>
+              <w:bottom w:type="dxa" w:w="60"/>
+              <w:right w:type="dxa" w:w="100"/>
+            </w:tcMar>
+            <w:vAlign w:val="top"/>
+          </w:tcPr>
+          <w:p>
+            <w:pPr>
+              <w:spacing w:after="40" w:line="252"/>
+              <w:jc w:val="left"/>
+            </w:pPr>
+            <w:r>
+              <w:rPr>
+                <w:b w:val="false"/>
+                <w:bCs w:val="false"/>
+                <w:color w:val="000000"/>
+                <w:sz w:val="18"/>
+                <w:szCs w:val="18"/>
+              </w:rPr>
+              <w:t xml:space="preserve">Sin superusuario</w:t>
+            </w:r>
+          </w:p>
+        </w:tc>
+        <w:tc>
+          <w:tcPr>
+            <w:tcW w:type="dxa" w:w="6686"/>
+            <w:tcBorders>
+              <w:top w:val="single" w:color="BFBFBF" w:sz="4"/>
+              <w:left w:val="single" w:color="BFBFBF" w:sz="4"/>
+              <w:bottom w:val="single" w:color="BFBFBF" w:sz="4"/>
+              <w:right w:val="single" w:color="BFBFBF" w:sz="4"/>
+            </w:tcBorders>
+            <w:shd w:fill="F2F7FB" w:val="clear"/>
+            <w:tcMar>
+              <w:top w:type="dxa" w:w="60"/>
+              <w:left w:type="dxa" w:w="100"/>
+              <w:bottom w:type="dxa" w:w="60"/>
+              <w:right w:type="dxa" w:w="100"/>
+            </w:tcMar>
+            <w:vAlign w:val="top"/>
+          </w:tcPr>
+          <w:p>
+            <w:pPr>
+              <w:spacing w:after="40" w:line="252"/>
+              <w:jc w:val="left"/>
+            </w:pPr>
+            <w:r>
+              <w:rPr>
+                <w:b w:val="false"/>
+                <w:bCs w:val="false"/>
+                <w:color w:val="000000"/>
+                <w:sz w:val="18"/>
+                <w:szCs w:val="18"/>
+              </w:rPr>
+              <w:t xml:space="preserve">Ninguna pieza opera como superusuario: postgres solo hace el arranque inicial; los objetos son de siget_owner y la aplicación usa app_role, sin BYPASSRLS ni capacidad de crear roles. Ver roles-permisos-bd.md</w:t>
+            </w:r>
+          </w:p>
+        </w:tc>
+      </w:tr>
     </w:tbl>
     <w:p>
       <w:pPr>
@@ -1426,7 +1502,7 @@
         <w:jc w:val="both"/>
       </w:pPr>
       <w:r>
-        <w:t xml:space="preserve">Roles de plataforma (sin acceso a trámites): administrador de plataforma y auditor.</w:t>
+        <w:t xml:space="preserve">Roles de plataforma (sin acceso a trámites): operador de plataforma y auditor.</w:t>
       </w:r>
     </w:p>
     <w:p>
@@ -2469,9 +2545,9 @@
         </w:tblBorders>
       </w:tblPr>
       <w:tblGrid>
-        <w:gridCol w:w="1719"/>
-        <w:gridCol w:w="3820"/>
-        <w:gridCol w:w="3821"/>
+        <w:gridCol w:w="1613"/>
+        <w:gridCol w:w="3873"/>
+        <w:gridCol w:w="3874"/>
       </w:tblGrid>
       <w:tr>
         <w:trPr>
@@ -2480,7 +2556,7 @@
         </w:trPr>
         <w:tc>
           <w:tcPr>
-            <w:tcW w:type="dxa" w:w="1719"/>
+            <w:tcW w:type="dxa" w:w="1613"/>
             <w:tcBorders>
               <w:top w:val="single" w:color="BFBFBF" w:sz="4"/>
               <w:left w:val="single" w:color="BFBFBF" w:sz="4"/>
@@ -2515,7 +2591,7 @@
         </w:tc>
         <w:tc>
           <w:tcPr>
-            <w:tcW w:type="dxa" w:w="3820"/>
+            <w:tcW w:type="dxa" w:w="3873"/>
             <w:tcBorders>
               <w:top w:val="single" w:color="BFBFBF" w:sz="4"/>
               <w:left w:val="single" w:color="BFBFBF" w:sz="4"/>
@@ -2550,7 +2626,7 @@
         </w:tc>
         <w:tc>
           <w:tcPr>
-            <w:tcW w:type="dxa" w:w="3821"/>
+            <w:tcW w:type="dxa" w:w="3874"/>
             <w:tcBorders>
               <w:top w:val="single" w:color="BFBFBF" w:sz="4"/>
               <w:left w:val="single" w:color="BFBFBF" w:sz="4"/>
@@ -2591,7 +2667,7 @@
         </w:trPr>
         <w:tc>
           <w:tcPr>
-            <w:tcW w:type="dxa" w:w="1719"/>
+            <w:tcW w:type="dxa" w:w="1613"/>
             <w:tcBorders>
               <w:top w:val="single" w:color="BFBFBF" w:sz="4"/>
               <w:left w:val="single" w:color="BFBFBF" w:sz="4"/>
@@ -2626,7 +2702,7 @@
         </w:tc>
         <w:tc>
           <w:tcPr>
-            <w:tcW w:type="dxa" w:w="3820"/>
+            <w:tcW w:type="dxa" w:w="3873"/>
             <w:tcBorders>
               <w:top w:val="single" w:color="BFBFBF" w:sz="4"/>
               <w:left w:val="single" w:color="BFBFBF" w:sz="4"/>
@@ -2661,7 +2737,7 @@
         </w:tc>
         <w:tc>
           <w:tcPr>
-            <w:tcW w:type="dxa" w:w="3821"/>
+            <w:tcW w:type="dxa" w:w="3874"/>
             <w:tcBorders>
               <w:top w:val="single" w:color="BFBFBF" w:sz="4"/>
               <w:left w:val="single" w:color="BFBFBF" w:sz="4"/>
@@ -2702,7 +2778,7 @@
         </w:trPr>
         <w:tc>
           <w:tcPr>
-            <w:tcW w:type="dxa" w:w="1719"/>
+            <w:tcW w:type="dxa" w:w="1613"/>
             <w:tcBorders>
               <w:top w:val="single" w:color="BFBFBF" w:sz="4"/>
               <w:left w:val="single" w:color="BFBFBF" w:sz="4"/>
@@ -2737,7 +2813,7 @@
         </w:tc>
         <w:tc>
           <w:tcPr>
-            <w:tcW w:type="dxa" w:w="3820"/>
+            <w:tcW w:type="dxa" w:w="3873"/>
             <w:tcBorders>
               <w:top w:val="single" w:color="BFBFBF" w:sz="4"/>
               <w:left w:val="single" w:color="BFBFBF" w:sz="4"/>
@@ -2772,7 +2848,7 @@
         </w:tc>
         <w:tc>
           <w:tcPr>
-            <w:tcW w:type="dxa" w:w="3821"/>
+            <w:tcW w:type="dxa" w:w="3874"/>
             <w:tcBorders>
               <w:top w:val="single" w:color="BFBFBF" w:sz="4"/>
               <w:left w:val="single" w:color="BFBFBF" w:sz="4"/>
@@ -2813,7 +2889,7 @@
         </w:trPr>
         <w:tc>
           <w:tcPr>
-            <w:tcW w:type="dxa" w:w="1719"/>
+            <w:tcW w:type="dxa" w:w="1613"/>
             <w:tcBorders>
               <w:top w:val="single" w:color="BFBFBF" w:sz="4"/>
               <w:left w:val="single" w:color="BFBFBF" w:sz="4"/>
@@ -2848,7 +2924,7 @@
         </w:tc>
         <w:tc>
           <w:tcPr>
-            <w:tcW w:type="dxa" w:w="3820"/>
+            <w:tcW w:type="dxa" w:w="3873"/>
             <w:tcBorders>
               <w:top w:val="single" w:color="BFBFBF" w:sz="4"/>
               <w:left w:val="single" w:color="BFBFBF" w:sz="4"/>
@@ -2883,7 +2959,7 @@
         </w:tc>
         <w:tc>
           <w:tcPr>
-            <w:tcW w:type="dxa" w:w="3821"/>
+            <w:tcW w:type="dxa" w:w="3874"/>
             <w:tcBorders>
               <w:top w:val="single" w:color="BFBFBF" w:sz="4"/>
               <w:left w:val="single" w:color="BFBFBF" w:sz="4"/>
@@ -2924,7 +3000,7 @@
         </w:trPr>
         <w:tc>
           <w:tcPr>
-            <w:tcW w:type="dxa" w:w="1719"/>
+            <w:tcW w:type="dxa" w:w="1613"/>
             <w:tcBorders>
               <w:top w:val="single" w:color="BFBFBF" w:sz="4"/>
               <w:left w:val="single" w:color="BFBFBF" w:sz="4"/>
@@ -2953,13 +3029,13 @@
                 <w:sz w:val="18"/>
                 <w:szCs w:val="18"/>
               </w:rPr>
-              <w:t xml:space="preserve">Administrador institucional</w:t>
-            </w:r>
-          </w:p>
-        </w:tc>
-        <w:tc>
-          <w:tcPr>
-            <w:tcW w:type="dxa" w:w="3820"/>
+              <w:t xml:space="preserve">Coordinador institucional</w:t>
+            </w:r>
+          </w:p>
+        </w:tc>
+        <w:tc>
+          <w:tcPr>
+            <w:tcW w:type="dxa" w:w="3873"/>
             <w:tcBorders>
               <w:top w:val="single" w:color="BFBFBF" w:sz="4"/>
               <w:left w:val="single" w:color="BFBFBF" w:sz="4"/>
@@ -2994,7 +3070,7 @@
         </w:tc>
         <w:tc>
           <w:tcPr>
-            <w:tcW w:type="dxa" w:w="3821"/>
+            <w:tcW w:type="dxa" w:w="3874"/>
             <w:tcBorders>
               <w:top w:val="single" w:color="BFBFBF" w:sz="4"/>
               <w:left w:val="single" w:color="BFBFBF" w:sz="4"/>
@@ -3035,7 +3111,7 @@
         </w:trPr>
         <w:tc>
           <w:tcPr>
-            <w:tcW w:type="dxa" w:w="1719"/>
+            <w:tcW w:type="dxa" w:w="1613"/>
             <w:tcBorders>
               <w:top w:val="single" w:color="BFBFBF" w:sz="4"/>
               <w:left w:val="single" w:color="BFBFBF" w:sz="4"/>
@@ -3064,13 +3140,13 @@
                 <w:sz w:val="18"/>
                 <w:szCs w:val="18"/>
               </w:rPr>
-              <w:t xml:space="preserve">Administrador de plataforma</w:t>
-            </w:r>
-          </w:p>
-        </w:tc>
-        <w:tc>
-          <w:tcPr>
-            <w:tcW w:type="dxa" w:w="3820"/>
+              <w:t xml:space="preserve">Operador de plataforma</w:t>
+            </w:r>
+          </w:p>
+        </w:tc>
+        <w:tc>
+          <w:tcPr>
+            <w:tcW w:type="dxa" w:w="3873"/>
             <w:tcBorders>
               <w:top w:val="single" w:color="BFBFBF" w:sz="4"/>
               <w:left w:val="single" w:color="BFBFBF" w:sz="4"/>
@@ -3105,7 +3181,7 @@
         </w:tc>
         <w:tc>
           <w:tcPr>
-            <w:tcW w:type="dxa" w:w="3821"/>
+            <w:tcW w:type="dxa" w:w="3874"/>
             <w:tcBorders>
               <w:top w:val="single" w:color="BFBFBF" w:sz="4"/>
               <w:left w:val="single" w:color="BFBFBF" w:sz="4"/>
@@ -3146,7 +3222,7 @@
         </w:trPr>
         <w:tc>
           <w:tcPr>
-            <w:tcW w:type="dxa" w:w="1719"/>
+            <w:tcW w:type="dxa" w:w="1613"/>
             <w:tcBorders>
               <w:top w:val="single" w:color="BFBFBF" w:sz="4"/>
               <w:left w:val="single" w:color="BFBFBF" w:sz="4"/>
@@ -3181,7 +3257,7 @@
         </w:tc>
         <w:tc>
           <w:tcPr>
-            <w:tcW w:type="dxa" w:w="3820"/>
+            <w:tcW w:type="dxa" w:w="3873"/>
             <w:tcBorders>
               <w:top w:val="single" w:color="BFBFBF" w:sz="4"/>
               <w:left w:val="single" w:color="BFBFBF" w:sz="4"/>
@@ -3216,7 +3292,7 @@
         </w:tc>
         <w:tc>
           <w:tcPr>
-            <w:tcW w:type="dxa" w:w="3821"/>
+            <w:tcW w:type="dxa" w:w="3874"/>
             <w:tcBorders>
               <w:top w:val="single" w:color="BFBFBF" w:sz="4"/>
               <w:left w:val="single" w:color="BFBFBF" w:sz="4"/>

</xml_diff>

<commit_message>
feat: dividir el rol de plataforma en cinco roles con control dual
</commit_message>
<xml_diff>
--- a/docs/SIGET_Arquitectura_Zero_Trust.docx
+++ b/docs/SIGET_Arquitectura_Zero_Trust.docx
@@ -1502,7 +1502,7 @@
         <w:jc w:val="both"/>
       </w:pPr>
       <w:r>
-        <w:t xml:space="preserve">Roles de plataforma (sin acceso a trámites): operador de plataforma y auditor.</w:t>
+        <w:t xml:space="preserve">Roles de plataforma (sin acceso a trámites): operador de infraestructura, operador de identidades, operador de catálogo, operador de seguridad, custodio de secretos y auditor. Un operador no puede ser a la vez operador de otra función ni tener membresías.</w:t>
       </w:r>
     </w:p>
     <w:p>
@@ -2545,9 +2545,9 @@
         </w:tblBorders>
       </w:tblPr>
       <w:tblGrid>
-        <w:gridCol w:w="1613"/>
-        <w:gridCol w:w="3873"/>
-        <w:gridCol w:w="3874"/>
+        <w:gridCol w:w="1719"/>
+        <w:gridCol w:w="3820"/>
+        <w:gridCol w:w="3821"/>
       </w:tblGrid>
       <w:tr>
         <w:trPr>
@@ -2556,7 +2556,7 @@
         </w:trPr>
         <w:tc>
           <w:tcPr>
-            <w:tcW w:type="dxa" w:w="1613"/>
+            <w:tcW w:type="dxa" w:w="1719"/>
             <w:tcBorders>
               <w:top w:val="single" w:color="BFBFBF" w:sz="4"/>
               <w:left w:val="single" w:color="BFBFBF" w:sz="4"/>
@@ -2591,7 +2591,7 @@
         </w:tc>
         <w:tc>
           <w:tcPr>
-            <w:tcW w:type="dxa" w:w="3873"/>
+            <w:tcW w:type="dxa" w:w="3820"/>
             <w:tcBorders>
               <w:top w:val="single" w:color="BFBFBF" w:sz="4"/>
               <w:left w:val="single" w:color="BFBFBF" w:sz="4"/>
@@ -2626,7 +2626,7 @@
         </w:tc>
         <w:tc>
           <w:tcPr>
-            <w:tcW w:type="dxa" w:w="3874"/>
+            <w:tcW w:type="dxa" w:w="3821"/>
             <w:tcBorders>
               <w:top w:val="single" w:color="BFBFBF" w:sz="4"/>
               <w:left w:val="single" w:color="BFBFBF" w:sz="4"/>
@@ -2667,7 +2667,7 @@
         </w:trPr>
         <w:tc>
           <w:tcPr>
-            <w:tcW w:type="dxa" w:w="1613"/>
+            <w:tcW w:type="dxa" w:w="1719"/>
             <w:tcBorders>
               <w:top w:val="single" w:color="BFBFBF" w:sz="4"/>
               <w:left w:val="single" w:color="BFBFBF" w:sz="4"/>
@@ -2702,7 +2702,7 @@
         </w:tc>
         <w:tc>
           <w:tcPr>
-            <w:tcW w:type="dxa" w:w="3873"/>
+            <w:tcW w:type="dxa" w:w="3820"/>
             <w:tcBorders>
               <w:top w:val="single" w:color="BFBFBF" w:sz="4"/>
               <w:left w:val="single" w:color="BFBFBF" w:sz="4"/>
@@ -2737,7 +2737,7 @@
         </w:tc>
         <w:tc>
           <w:tcPr>
-            <w:tcW w:type="dxa" w:w="3874"/>
+            <w:tcW w:type="dxa" w:w="3821"/>
             <w:tcBorders>
               <w:top w:val="single" w:color="BFBFBF" w:sz="4"/>
               <w:left w:val="single" w:color="BFBFBF" w:sz="4"/>
@@ -2778,7 +2778,7 @@
         </w:trPr>
         <w:tc>
           <w:tcPr>
-            <w:tcW w:type="dxa" w:w="1613"/>
+            <w:tcW w:type="dxa" w:w="1719"/>
             <w:tcBorders>
               <w:top w:val="single" w:color="BFBFBF" w:sz="4"/>
               <w:left w:val="single" w:color="BFBFBF" w:sz="4"/>
@@ -2813,7 +2813,7 @@
         </w:tc>
         <w:tc>
           <w:tcPr>
-            <w:tcW w:type="dxa" w:w="3873"/>
+            <w:tcW w:type="dxa" w:w="3820"/>
             <w:tcBorders>
               <w:top w:val="single" w:color="BFBFBF" w:sz="4"/>
               <w:left w:val="single" w:color="BFBFBF" w:sz="4"/>
@@ -2848,7 +2848,7 @@
         </w:tc>
         <w:tc>
           <w:tcPr>
-            <w:tcW w:type="dxa" w:w="3874"/>
+            <w:tcW w:type="dxa" w:w="3821"/>
             <w:tcBorders>
               <w:top w:val="single" w:color="BFBFBF" w:sz="4"/>
               <w:left w:val="single" w:color="BFBFBF" w:sz="4"/>
@@ -2889,7 +2889,7 @@
         </w:trPr>
         <w:tc>
           <w:tcPr>
-            <w:tcW w:type="dxa" w:w="1613"/>
+            <w:tcW w:type="dxa" w:w="1719"/>
             <w:tcBorders>
               <w:top w:val="single" w:color="BFBFBF" w:sz="4"/>
               <w:left w:val="single" w:color="BFBFBF" w:sz="4"/>
@@ -2924,7 +2924,7 @@
         </w:tc>
         <w:tc>
           <w:tcPr>
-            <w:tcW w:type="dxa" w:w="3873"/>
+            <w:tcW w:type="dxa" w:w="3820"/>
             <w:tcBorders>
               <w:top w:val="single" w:color="BFBFBF" w:sz="4"/>
               <w:left w:val="single" w:color="BFBFBF" w:sz="4"/>
@@ -2959,7 +2959,7 @@
         </w:tc>
         <w:tc>
           <w:tcPr>
-            <w:tcW w:type="dxa" w:w="3874"/>
+            <w:tcW w:type="dxa" w:w="3821"/>
             <w:tcBorders>
               <w:top w:val="single" w:color="BFBFBF" w:sz="4"/>
               <w:left w:val="single" w:color="BFBFBF" w:sz="4"/>
@@ -3000,7 +3000,7 @@
         </w:trPr>
         <w:tc>
           <w:tcPr>
-            <w:tcW w:type="dxa" w:w="1613"/>
+            <w:tcW w:type="dxa" w:w="1719"/>
             <w:tcBorders>
               <w:top w:val="single" w:color="BFBFBF" w:sz="4"/>
               <w:left w:val="single" w:color="BFBFBF" w:sz="4"/>
@@ -3035,7 +3035,7 @@
         </w:tc>
         <w:tc>
           <w:tcPr>
-            <w:tcW w:type="dxa" w:w="3873"/>
+            <w:tcW w:type="dxa" w:w="3820"/>
             <w:tcBorders>
               <w:top w:val="single" w:color="BFBFBF" w:sz="4"/>
               <w:left w:val="single" w:color="BFBFBF" w:sz="4"/>
@@ -3070,7 +3070,7 @@
         </w:tc>
         <w:tc>
           <w:tcPr>
-            <w:tcW w:type="dxa" w:w="3874"/>
+            <w:tcW w:type="dxa" w:w="3821"/>
             <w:tcBorders>
               <w:top w:val="single" w:color="BFBFBF" w:sz="4"/>
               <w:left w:val="single" w:color="BFBFBF" w:sz="4"/>
@@ -3111,7 +3111,7 @@
         </w:trPr>
         <w:tc>
           <w:tcPr>
-            <w:tcW w:type="dxa" w:w="1613"/>
+            <w:tcW w:type="dxa" w:w="1719"/>
             <w:tcBorders>
               <w:top w:val="single" w:color="BFBFBF" w:sz="4"/>
               <w:left w:val="single" w:color="BFBFBF" w:sz="4"/>
@@ -3140,13 +3140,13 @@
                 <w:sz w:val="18"/>
                 <w:szCs w:val="18"/>
               </w:rPr>
-              <w:t xml:space="preserve">Operador de plataforma</w:t>
-            </w:r>
-          </w:p>
-        </w:tc>
-        <w:tc>
-          <w:tcPr>
-            <w:tcW w:type="dxa" w:w="3873"/>
+              <w:t xml:space="preserve">Operador de infraestructura</w:t>
+            </w:r>
+          </w:p>
+        </w:tc>
+        <w:tc>
+          <w:tcPr>
+            <w:tcW w:type="dxa" w:w="3820"/>
             <w:tcBorders>
               <w:top w:val="single" w:color="BFBFBF" w:sz="4"/>
               <w:left w:val="single" w:color="BFBFBF" w:sz="4"/>
@@ -3175,13 +3175,13 @@
                 <w:sz w:val="18"/>
                 <w:szCs w:val="18"/>
               </w:rPr>
-              <w:t xml:space="preserve">Alta de instituciones, infraestructura, catálogo base</w:t>
-            </w:r>
-          </w:p>
-        </w:tc>
-        <w:tc>
-          <w:tcPr>
-            <w:tcW w:type="dxa" w:w="3874"/>
+              <w:t xml:space="preserve">Servidores, contenedores, despliegues y parches</w:t>
+            </w:r>
+          </w:p>
+        </w:tc>
+        <w:tc>
+          <w:tcPr>
+            <w:tcW w:type="dxa" w:w="3821"/>
             <w:tcBorders>
               <w:top w:val="single" w:color="BFBFBF" w:sz="4"/>
               <w:left w:val="single" w:color="BFBFBF" w:sz="4"/>
@@ -3210,7 +3210,7 @@
                 <w:sz w:val="18"/>
                 <w:szCs w:val="18"/>
               </w:rPr>
-              <w:t xml:space="preserve">Sin acceso a trámites ni a documentos</w:t>
+              <w:t xml:space="preserve">Sin acceso a trámites, documentos ni gestión de usuarios</w:t>
             </w:r>
           </w:p>
         </w:tc>
@@ -3222,7 +3222,7 @@
         </w:trPr>
         <w:tc>
           <w:tcPr>
-            <w:tcW w:type="dxa" w:w="1613"/>
+            <w:tcW w:type="dxa" w:w="1719"/>
             <w:tcBorders>
               <w:top w:val="single" w:color="BFBFBF" w:sz="4"/>
               <w:left w:val="single" w:color="BFBFBF" w:sz="4"/>
@@ -3251,13 +3251,457 @@
                 <w:sz w:val="18"/>
                 <w:szCs w:val="18"/>
               </w:rPr>
+              <w:t xml:space="preserve">Operador de identidades</w:t>
+            </w:r>
+          </w:p>
+        </w:tc>
+        <w:tc>
+          <w:tcPr>
+            <w:tcW w:type="dxa" w:w="3820"/>
+            <w:tcBorders>
+              <w:top w:val="single" w:color="BFBFBF" w:sz="4"/>
+              <w:left w:val="single" w:color="BFBFBF" w:sz="4"/>
+              <w:bottom w:val="single" w:color="BFBFBF" w:sz="4"/>
+              <w:right w:val="single" w:color="BFBFBF" w:sz="4"/>
+            </w:tcBorders>
+            <w:shd w:fill="F2F7FB" w:val="clear"/>
+            <w:tcMar>
+              <w:top w:type="dxa" w:w="60"/>
+              <w:left w:type="dxa" w:w="100"/>
+              <w:bottom w:type="dxa" w:w="60"/>
+              <w:right w:type="dxa" w:w="100"/>
+            </w:tcMar>
+            <w:vAlign w:val="top"/>
+          </w:tcPr>
+          <w:p>
+            <w:pPr>
+              <w:spacing w:after="40" w:line="252"/>
+              <w:jc w:val="left"/>
+            </w:pPr>
+            <w:r>
+              <w:rPr>
+                <w:b w:val="false"/>
+                <w:bCs w:val="false"/>
+                <w:color w:val="000000"/>
+                <w:sz w:val="18"/>
+                <w:szCs w:val="18"/>
+              </w:rPr>
+              <w:t xml:space="preserve">Altas de coordinadores institucionales y restablecer el segundo factor</w:t>
+            </w:r>
+          </w:p>
+        </w:tc>
+        <w:tc>
+          <w:tcPr>
+            <w:tcW w:type="dxa" w:w="3821"/>
+            <w:tcBorders>
+              <w:top w:val="single" w:color="BFBFBF" w:sz="4"/>
+              <w:left w:val="single" w:color="BFBFBF" w:sz="4"/>
+              <w:bottom w:val="single" w:color="BFBFBF" w:sz="4"/>
+              <w:right w:val="single" w:color="BFBFBF" w:sz="4"/>
+            </w:tcBorders>
+            <w:shd w:fill="F2F7FB" w:val="clear"/>
+            <w:tcMar>
+              <w:top w:type="dxa" w:w="60"/>
+              <w:left w:type="dxa" w:w="100"/>
+              <w:bottom w:type="dxa" w:w="60"/>
+              <w:right w:type="dxa" w:w="100"/>
+            </w:tcMar>
+            <w:vAlign w:val="top"/>
+          </w:tcPr>
+          <w:p>
+            <w:pPr>
+              <w:spacing w:after="40" w:line="252"/>
+              <w:jc w:val="left"/>
+            </w:pPr>
+            <w:r>
+              <w:rPr>
+                <w:b w:val="false"/>
+                <w:bCs w:val="false"/>
+                <w:color w:val="000000"/>
+                <w:sz w:val="18"/>
+                <w:szCs w:val="18"/>
+              </w:rPr>
+              <w:t xml:space="preserve">Alta con control dual; sin acceso a trámites ni a infraestructura</w:t>
+            </w:r>
+          </w:p>
+        </w:tc>
+      </w:tr>
+      <w:tr>
+        <w:trPr>
+          <w:cantSplit/>
+          <w:tblHeader w:val="off"/>
+        </w:trPr>
+        <w:tc>
+          <w:tcPr>
+            <w:tcW w:type="dxa" w:w="1719"/>
+            <w:tcBorders>
+              <w:top w:val="single" w:color="BFBFBF" w:sz="4"/>
+              <w:left w:val="single" w:color="BFBFBF" w:sz="4"/>
+              <w:bottom w:val="single" w:color="BFBFBF" w:sz="4"/>
+              <w:right w:val="single" w:color="BFBFBF" w:sz="4"/>
+            </w:tcBorders>
+            <w:shd w:fill="FFFFFF" w:val="clear"/>
+            <w:tcMar>
+              <w:top w:type="dxa" w:w="60"/>
+              <w:left w:type="dxa" w:w="100"/>
+              <w:bottom w:type="dxa" w:w="60"/>
+              <w:right w:type="dxa" w:w="100"/>
+            </w:tcMar>
+            <w:vAlign w:val="top"/>
+          </w:tcPr>
+          <w:p>
+            <w:pPr>
+              <w:spacing w:after="40" w:line="252"/>
+              <w:jc w:val="left"/>
+            </w:pPr>
+            <w:r>
+              <w:rPr>
+                <w:b w:val="false"/>
+                <w:bCs w:val="false"/>
+                <w:color w:val="000000"/>
+                <w:sz w:val="18"/>
+                <w:szCs w:val="18"/>
+              </w:rPr>
+              <w:t xml:space="preserve">Operador de catálogo</w:t>
+            </w:r>
+          </w:p>
+        </w:tc>
+        <w:tc>
+          <w:tcPr>
+            <w:tcW w:type="dxa" w:w="3820"/>
+            <w:tcBorders>
+              <w:top w:val="single" w:color="BFBFBF" w:sz="4"/>
+              <w:left w:val="single" w:color="BFBFBF" w:sz="4"/>
+              <w:bottom w:val="single" w:color="BFBFBF" w:sz="4"/>
+              <w:right w:val="single" w:color="BFBFBF" w:sz="4"/>
+            </w:tcBorders>
+            <w:shd w:fill="FFFFFF" w:val="clear"/>
+            <w:tcMar>
+              <w:top w:type="dxa" w:w="60"/>
+              <w:left w:type="dxa" w:w="100"/>
+              <w:bottom w:type="dxa" w:w="60"/>
+              <w:right w:type="dxa" w:w="100"/>
+            </w:tcMar>
+            <w:vAlign w:val="top"/>
+          </w:tcPr>
+          <w:p>
+            <w:pPr>
+              <w:spacing w:after="40" w:line="252"/>
+              <w:jc w:val="left"/>
+            </w:pPr>
+            <w:r>
+              <w:rPr>
+                <w:b w:val="false"/>
+                <w:bCs w:val="false"/>
+                <w:color w:val="000000"/>
+                <w:sz w:val="18"/>
+                <w:szCs w:val="18"/>
+              </w:rPr>
+              <w:t xml:space="preserve">Alta de instituciones y de los tipos de trámite base</w:t>
+            </w:r>
+          </w:p>
+        </w:tc>
+        <w:tc>
+          <w:tcPr>
+            <w:tcW w:type="dxa" w:w="3821"/>
+            <w:tcBorders>
+              <w:top w:val="single" w:color="BFBFBF" w:sz="4"/>
+              <w:left w:val="single" w:color="BFBFBF" w:sz="4"/>
+              <w:bottom w:val="single" w:color="BFBFBF" w:sz="4"/>
+              <w:right w:val="single" w:color="BFBFBF" w:sz="4"/>
+            </w:tcBorders>
+            <w:shd w:fill="FFFFFF" w:val="clear"/>
+            <w:tcMar>
+              <w:top w:type="dxa" w:w="60"/>
+              <w:left w:type="dxa" w:w="100"/>
+              <w:bottom w:type="dxa" w:w="60"/>
+              <w:right w:type="dxa" w:w="100"/>
+            </w:tcMar>
+            <w:vAlign w:val="top"/>
+          </w:tcPr>
+          <w:p>
+            <w:pPr>
+              <w:spacing w:after="40" w:line="252"/>
+              <w:jc w:val="left"/>
+            </w:pPr>
+            <w:r>
+              <w:rPr>
+                <w:b w:val="false"/>
+                <w:bCs w:val="false"/>
+                <w:color w:val="000000"/>
+                <w:sz w:val="18"/>
+                <w:szCs w:val="18"/>
+              </w:rPr>
+              <w:t xml:space="preserve">Alta con control dual; sin acceso a usuarios ni a infraestructura</w:t>
+            </w:r>
+          </w:p>
+        </w:tc>
+      </w:tr>
+      <w:tr>
+        <w:trPr>
+          <w:cantSplit/>
+          <w:tblHeader w:val="off"/>
+        </w:trPr>
+        <w:tc>
+          <w:tcPr>
+            <w:tcW w:type="dxa" w:w="1719"/>
+            <w:tcBorders>
+              <w:top w:val="single" w:color="BFBFBF" w:sz="4"/>
+              <w:left w:val="single" w:color="BFBFBF" w:sz="4"/>
+              <w:bottom w:val="single" w:color="BFBFBF" w:sz="4"/>
+              <w:right w:val="single" w:color="BFBFBF" w:sz="4"/>
+            </w:tcBorders>
+            <w:shd w:fill="F2F7FB" w:val="clear"/>
+            <w:tcMar>
+              <w:top w:type="dxa" w:w="60"/>
+              <w:left w:type="dxa" w:w="100"/>
+              <w:bottom w:type="dxa" w:w="60"/>
+              <w:right w:type="dxa" w:w="100"/>
+            </w:tcMar>
+            <w:vAlign w:val="top"/>
+          </w:tcPr>
+          <w:p>
+            <w:pPr>
+              <w:spacing w:after="40" w:line="252"/>
+              <w:jc w:val="left"/>
+            </w:pPr>
+            <w:r>
+              <w:rPr>
+                <w:b w:val="false"/>
+                <w:bCs w:val="false"/>
+                <w:color w:val="000000"/>
+                <w:sz w:val="18"/>
+                <w:szCs w:val="18"/>
+              </w:rPr>
+              <w:t xml:space="preserve">Operador de seguridad</w:t>
+            </w:r>
+          </w:p>
+        </w:tc>
+        <w:tc>
+          <w:tcPr>
+            <w:tcW w:type="dxa" w:w="3820"/>
+            <w:tcBorders>
+              <w:top w:val="single" w:color="BFBFBF" w:sz="4"/>
+              <w:left w:val="single" w:color="BFBFBF" w:sz="4"/>
+              <w:bottom w:val="single" w:color="BFBFBF" w:sz="4"/>
+              <w:right w:val="single" w:color="BFBFBF" w:sz="4"/>
+            </w:tcBorders>
+            <w:shd w:fill="F2F7FB" w:val="clear"/>
+            <w:tcMar>
+              <w:top w:type="dxa" w:w="60"/>
+              <w:left w:type="dxa" w:w="100"/>
+              <w:bottom w:type="dxa" w:w="60"/>
+              <w:right w:type="dxa" w:w="100"/>
+            </w:tcMar>
+            <w:vAlign w:val="top"/>
+          </w:tcPr>
+          <w:p>
+            <w:pPr>
+              <w:spacing w:after="40" w:line="252"/>
+              <w:jc w:val="left"/>
+            </w:pPr>
+            <w:r>
+              <w:rPr>
+                <w:b w:val="false"/>
+                <w:bCs w:val="false"/>
+                <w:color w:val="000000"/>
+                <w:sz w:val="18"/>
+                <w:szCs w:val="18"/>
+              </w:rPr>
+              <w:t xml:space="preserve">Bloquear cuentas y revocar sesiones ante incidentes</w:t>
+            </w:r>
+          </w:p>
+        </w:tc>
+        <w:tc>
+          <w:tcPr>
+            <w:tcW w:type="dxa" w:w="3821"/>
+            <w:tcBorders>
+              <w:top w:val="single" w:color="BFBFBF" w:sz="4"/>
+              <w:left w:val="single" w:color="BFBFBF" w:sz="4"/>
+              <w:bottom w:val="single" w:color="BFBFBF" w:sz="4"/>
+              <w:right w:val="single" w:color="BFBFBF" w:sz="4"/>
+            </w:tcBorders>
+            <w:shd w:fill="F2F7FB" w:val="clear"/>
+            <w:tcMar>
+              <w:top w:type="dxa" w:w="60"/>
+              <w:left w:type="dxa" w:w="100"/>
+              <w:bottom w:type="dxa" w:w="60"/>
+              <w:right w:type="dxa" w:w="100"/>
+            </w:tcMar>
+            <w:vAlign w:val="top"/>
+          </w:tcPr>
+          <w:p>
+            <w:pPr>
+              <w:spacing w:after="40" w:line="252"/>
+              <w:jc w:val="left"/>
+            </w:pPr>
+            <w:r>
+              <w:rPr>
+                <w:b w:val="false"/>
+                <w:bCs w:val="false"/>
+                <w:color w:val="000000"/>
+                <w:sz w:val="18"/>
+                <w:szCs w:val="18"/>
+              </w:rPr>
+              <w:t xml:space="preserve">No crea cuentas, no lee trámites y no modifica la auditoría</w:t>
+            </w:r>
+          </w:p>
+        </w:tc>
+      </w:tr>
+      <w:tr>
+        <w:trPr>
+          <w:cantSplit/>
+          <w:tblHeader w:val="off"/>
+        </w:trPr>
+        <w:tc>
+          <w:tcPr>
+            <w:tcW w:type="dxa" w:w="1719"/>
+            <w:tcBorders>
+              <w:top w:val="single" w:color="BFBFBF" w:sz="4"/>
+              <w:left w:val="single" w:color="BFBFBF" w:sz="4"/>
+              <w:bottom w:val="single" w:color="BFBFBF" w:sz="4"/>
+              <w:right w:val="single" w:color="BFBFBF" w:sz="4"/>
+            </w:tcBorders>
+            <w:shd w:fill="FFFFFF" w:val="clear"/>
+            <w:tcMar>
+              <w:top w:type="dxa" w:w="60"/>
+              <w:left w:type="dxa" w:w="100"/>
+              <w:bottom w:type="dxa" w:w="60"/>
+              <w:right w:type="dxa" w:w="100"/>
+            </w:tcMar>
+            <w:vAlign w:val="top"/>
+          </w:tcPr>
+          <w:p>
+            <w:pPr>
+              <w:spacing w:after="40" w:line="252"/>
+              <w:jc w:val="left"/>
+            </w:pPr>
+            <w:r>
+              <w:rPr>
+                <w:b w:val="false"/>
+                <w:bCs w:val="false"/>
+                <w:color w:val="000000"/>
+                <w:sz w:val="18"/>
+                <w:szCs w:val="18"/>
+              </w:rPr>
+              <w:t xml:space="preserve">Custodio de secretos</w:t>
+            </w:r>
+          </w:p>
+        </w:tc>
+        <w:tc>
+          <w:tcPr>
+            <w:tcW w:type="dxa" w:w="3820"/>
+            <w:tcBorders>
+              <w:top w:val="single" w:color="BFBFBF" w:sz="4"/>
+              <w:left w:val="single" w:color="BFBFBF" w:sz="4"/>
+              <w:bottom w:val="single" w:color="BFBFBF" w:sz="4"/>
+              <w:right w:val="single" w:color="BFBFBF" w:sz="4"/>
+            </w:tcBorders>
+            <w:shd w:fill="FFFFFF" w:val="clear"/>
+            <w:tcMar>
+              <w:top w:type="dxa" w:w="60"/>
+              <w:left w:type="dxa" w:w="100"/>
+              <w:bottom w:type="dxa" w:w="60"/>
+              <w:right w:type="dxa" w:w="100"/>
+            </w:tcMar>
+            <w:vAlign w:val="top"/>
+          </w:tcPr>
+          <w:p>
+            <w:pPr>
+              <w:spacing w:after="40" w:line="252"/>
+              <w:jc w:val="left"/>
+            </w:pPr>
+            <w:r>
+              <w:rPr>
+                <w:b w:val="false"/>
+                <w:bCs w:val="false"/>
+                <w:color w:val="000000"/>
+                <w:sz w:val="18"/>
+                <w:szCs w:val="18"/>
+              </w:rPr>
+              <w:t xml:space="preserve">Rotar contraseñas, claves y certificados</w:t>
+            </w:r>
+          </w:p>
+        </w:tc>
+        <w:tc>
+          <w:tcPr>
+            <w:tcW w:type="dxa" w:w="3821"/>
+            <w:tcBorders>
+              <w:top w:val="single" w:color="BFBFBF" w:sz="4"/>
+              <w:left w:val="single" w:color="BFBFBF" w:sz="4"/>
+              <w:bottom w:val="single" w:color="BFBFBF" w:sz="4"/>
+              <w:right w:val="single" w:color="BFBFBF" w:sz="4"/>
+            </w:tcBorders>
+            <w:shd w:fill="FFFFFF" w:val="clear"/>
+            <w:tcMar>
+              <w:top w:type="dxa" w:w="60"/>
+              <w:left w:type="dxa" w:w="100"/>
+              <w:bottom w:type="dxa" w:w="60"/>
+              <w:right w:type="dxa" w:w="100"/>
+            </w:tcMar>
+            <w:vAlign w:val="top"/>
+          </w:tcPr>
+          <w:p>
+            <w:pPr>
+              <w:spacing w:after="40" w:line="252"/>
+              <w:jc w:val="left"/>
+            </w:pPr>
+            <w:r>
+              <w:rPr>
+                <w:b w:val="false"/>
+                <w:bCs w:val="false"/>
+                <w:color w:val="000000"/>
+                <w:sz w:val="18"/>
+                <w:szCs w:val="18"/>
+              </w:rPr>
+              <w:t xml:space="preserve">No despliega, no crea usuarios y no lee datos</w:t>
+            </w:r>
+          </w:p>
+        </w:tc>
+      </w:tr>
+      <w:tr>
+        <w:trPr>
+          <w:cantSplit/>
+          <w:tblHeader w:val="off"/>
+        </w:trPr>
+        <w:tc>
+          <w:tcPr>
+            <w:tcW w:type="dxa" w:w="1719"/>
+            <w:tcBorders>
+              <w:top w:val="single" w:color="BFBFBF" w:sz="4"/>
+              <w:left w:val="single" w:color="BFBFBF" w:sz="4"/>
+              <w:bottom w:val="single" w:color="BFBFBF" w:sz="4"/>
+              <w:right w:val="single" w:color="BFBFBF" w:sz="4"/>
+            </w:tcBorders>
+            <w:shd w:fill="F2F7FB" w:val="clear"/>
+            <w:tcMar>
+              <w:top w:type="dxa" w:w="60"/>
+              <w:left w:type="dxa" w:w="100"/>
+              <w:bottom w:type="dxa" w:w="60"/>
+              <w:right w:type="dxa" w:w="100"/>
+            </w:tcMar>
+            <w:vAlign w:val="top"/>
+          </w:tcPr>
+          <w:p>
+            <w:pPr>
+              <w:spacing w:after="40" w:line="252"/>
+              <w:jc w:val="left"/>
+            </w:pPr>
+            <w:r>
+              <w:rPr>
+                <w:b w:val="false"/>
+                <w:bCs w:val="false"/>
+                <w:color w:val="000000"/>
+                <w:sz w:val="18"/>
+                <w:szCs w:val="18"/>
+              </w:rPr>
               <w:t xml:space="preserve">Auditor</w:t>
             </w:r>
           </w:p>
         </w:tc>
         <w:tc>
           <w:tcPr>
-            <w:tcW w:type="dxa" w:w="3873"/>
+            <w:tcW w:type="dxa" w:w="3820"/>
             <w:tcBorders>
               <w:top w:val="single" w:color="BFBFBF" w:sz="4"/>
               <w:left w:val="single" w:color="BFBFBF" w:sz="4"/>
@@ -3292,7 +3736,7 @@
         </w:tc>
         <w:tc>
           <w:tcPr>
-            <w:tcW w:type="dxa" w:w="3874"/>
+            <w:tcW w:type="dxa" w:w="3821"/>
             <w:tcBorders>
               <w:top w:val="single" w:color="BFBFBF" w:sz="4"/>
               <w:left w:val="single" w:color="BFBFBF" w:sz="4"/>
@@ -3381,6 +3825,34 @@
       </w:pPr>
       <w:r>
         <w:t xml:space="preserve">Los estados finales (Aprobado, Rechazado) no admiten más transiciones.</w:t>
+      </w:r>
+    </w:p>
+    <w:p>
+      <w:pPr>
+        <w:pStyle w:val="ListParagraph"/>
+        <w:numPr>
+          <w:ilvl w:val="0"/>
+          <w:numId w:val="2"/>
+        </w:numPr>
+        <w:spacing w:after="80" w:line="276"/>
+        <w:jc w:val="both"/>
+      </w:pPr>
+      <w:r>
+        <w:t xml:space="preserve">Una persona tiene un solo rol de plataforma, y quien lo tiene no puede tener membresías de institución (ni al revés): lo impone la base con triggers.</w:t>
+      </w:r>
+    </w:p>
+    <w:p>
+      <w:pPr>
+        <w:pStyle w:val="ListParagraph"/>
+        <w:numPr>
+          <w:ilvl w:val="0"/>
+          <w:numId w:val="2"/>
+        </w:numPr>
+        <w:spacing w:after="80" w:line="276"/>
+        <w:jc w:val="both"/>
+      </w:pPr>
+      <w:r>
+        <w:t xml:space="preserve">Control dual: dar de alta una institución o un coordinador requiere dos personas distintas; quien propone no puede aprobar (aprobacion_control_dual).</w:t>
       </w:r>
     </w:p>
     <w:p/>

</xml_diff>